<commit_message>
docs:se elimina comunicacion 6
</commit_message>
<xml_diff>
--- a/docs/diseño_comunicacion_sincronica_asincronica.docx
+++ b/docs/diseño_comunicacion_sincronica_asincronica.docx
@@ -1,6 +1,6 @@
 
 <file path=word/document.xml><?xml version="1.0" encoding="utf-8"?>
-<w:document xmlns:wpc="http://schemas.microsoft.com/office/word/2010/wordprocessingCanvas" xmlns:cx="http://schemas.microsoft.com/office/drawing/2014/chartex" xmlns:cx1="http://schemas.microsoft.com/office/drawing/2015/9/8/chartex" xmlns:cx2="http://schemas.microsoft.com/office/drawing/2015/10/21/chartex" xmlns:cx3="http://schemas.microsoft.com/office/drawing/2016/5/9/chartex" xmlns:cx4="http://schemas.microsoft.com/office/drawing/2016/5/10/chartex" xmlns:cx5="http://schemas.microsoft.com/office/drawing/2016/5/11/chartex" xmlns:cx6="http://schemas.microsoft.com/office/drawing/2016/5/12/chartex" xmlns:cx7="http://schemas.microsoft.com/office/drawing/2016/5/13/chartex" xmlns:cx8="http://schemas.microsoft.com/office/drawing/2016/5/14/chartex" xmlns:mc="http://schemas.openxmlformats.org/markup-compatibility/2006" xmlns:aink="http://schemas.microsoft.com/office/drawing/2016/ink" xmlns:am3d="http://schemas.microsoft.com/office/drawing/2017/model3d" xmlns:o="urn:schemas-microsoft-com:office:office" xmlns:oel="http://schemas.microsoft.com/office/2019/extlst" xmlns:r="http://schemas.openxmlformats.org/officeDocument/2006/relationships" xmlns:m="http://schemas.openxmlformats.org/officeDocument/2006/math" xmlns:v="urn:schemas-microsoft-com:vml" xmlns:wp14="http://schemas.microsoft.com/office/word/2010/wordprocessingDrawing" xmlns:wp="http://schemas.openxmlformats.org/drawingml/2006/wordprocessingDrawing" xmlns:w10="urn:schemas-microsoft-com:office:word" xmlns:w="http://schemas.openxmlformats.org/wordprocessingml/2006/main" xmlns:w14="http://schemas.microsoft.com/office/word/2010/wordml" xmlns:w15="http://schemas.microsoft.com/office/word/2012/wordml" xmlns:w16cex="http://schemas.microsoft.com/office/word/2018/wordml/cex" xmlns:w16cid="http://schemas.microsoft.com/office/word/2016/wordml/cid" xmlns:w16="http://schemas.microsoft.com/office/word/2018/wordml" xmlns:w16du="http://schemas.microsoft.com/office/word/2023/wordml/word16du" xmlns:w16sdtdh="http://schemas.microsoft.com/office/word/2020/wordml/sdtdatahash" xmlns:w16sdtfl="http://schemas.microsoft.com/office/word/2024/wordml/sdtformatlock" xmlns:w16se="http://schemas.microsoft.com/office/word/2015/wordml/symex" xmlns:wpg="http://schemas.microsoft.com/office/word/2010/wordprocessingGroup" xmlns:wpi="http://schemas.microsoft.com/office/word/2010/wordprocessingInk" xmlns:wne="http://schemas.microsoft.com/office/word/2006/wordml" xmlns:wps="http://schemas.microsoft.com/office/word/2010/wordprocessingShape" mc:Ignorable="w14 w15 w16se w16cid w16 w16cex w16sdtdh w16sdtfl w16du wp14">
+<w:document xmlns:wpc="http://schemas.microsoft.com/office/word/2010/wordprocessingCanvas" xmlns:cx="http://schemas.microsoft.com/office/drawing/2014/chartex" xmlns:cx1="http://schemas.microsoft.com/office/drawing/2015/9/8/chartex" xmlns:cx2="http://schemas.microsoft.com/office/drawing/2015/10/21/chartex" xmlns:cx3="http://schemas.microsoft.com/office/drawing/2016/5/9/chartex" xmlns:cx4="http://schemas.microsoft.com/office/drawing/2016/5/10/chartex" xmlns:cx5="http://schemas.microsoft.com/office/drawing/2016/5/11/chartex" xmlns:cx6="http://schemas.microsoft.com/office/drawing/2016/5/12/chartex" xmlns:cx7="http://schemas.microsoft.com/office/drawing/2016/5/13/chartex" xmlns:cx8="http://schemas.microsoft.com/office/drawing/2016/5/14/chartex" xmlns:mc="http://schemas.openxmlformats.org/markup-compatibility/2006" xmlns:aink="http://schemas.microsoft.com/office/drawing/2016/ink" xmlns:am3d="http://schemas.microsoft.com/office/drawing/2017/model3d" xmlns:o="urn:schemas-microsoft-com:office:office" xmlns:oel="http://schemas.microsoft.com/office/2019/extlst" xmlns:r="http://schemas.openxmlformats.org/officeDocument/2006/relationships" xmlns:m="http://schemas.openxmlformats.org/officeDocument/2006/math" xmlns:v="urn:schemas-microsoft-com:vml" xmlns:wp14="http://schemas.microsoft.com/office/word/2010/wordprocessingDrawing" xmlns:wp="http://schemas.openxmlformats.org/drawingml/2006/wordprocessingDrawing" xmlns:w10="urn:schemas-microsoft-com:office:word" xmlns:w="http://schemas.openxmlformats.org/wordprocessingml/2006/main" xmlns:w14="http://schemas.microsoft.com/office/word/2010/wordml" xmlns:w15="http://schemas.microsoft.com/office/word/2012/wordml" xmlns:w16cex="http://schemas.microsoft.com/office/word/2018/wordml/cex" xmlns:w16cid="http://schemas.microsoft.com/office/word/2016/wordml/cid" xmlns:w16="http://schemas.microsoft.com/office/word/2018/wordml" xmlns:w16sdtdh="http://schemas.microsoft.com/office/word/2020/wordml/sdtdatahash" xmlns:w16se="http://schemas.microsoft.com/office/word/2015/wordml/symex" xmlns:wpg="http://schemas.microsoft.com/office/word/2010/wordprocessingGroup" xmlns:wpi="http://schemas.microsoft.com/office/word/2010/wordprocessingInk" xmlns:wne="http://schemas.microsoft.com/office/word/2006/wordml" xmlns:wps="http://schemas.microsoft.com/office/word/2010/wordprocessingShape" mc:Ignorable="w14 w15 w16se w16cid w16 w16cex w16sdtdh wp14">
   <w:body>
     <w:p>
       <w:pPr>
@@ -96,7 +96,35 @@
         <w:rPr>
           <w:lang w:val="es-419"/>
         </w:rPr>
-        <w:t>El cliente entra a la página y solicita las plantas disponibles. El frontend envía una petición al backend y espera la respuesta con la información.</w:t>
+        <w:t xml:space="preserve">El cliente entra a la página y solicita las plantas disponibles. El </w:t>
+      </w:r>
+      <w:proofErr w:type="spellStart"/>
+      <w:r>
+        <w:rPr>
+          <w:lang w:val="es-419"/>
+        </w:rPr>
+        <w:t>frontend</w:t>
+      </w:r>
+      <w:proofErr w:type="spellEnd"/>
+      <w:r>
+        <w:rPr>
+          <w:lang w:val="es-419"/>
+        </w:rPr>
+        <w:t xml:space="preserve"> envía una petición al </w:t>
+      </w:r>
+      <w:proofErr w:type="spellStart"/>
+      <w:r>
+        <w:rPr>
+          <w:lang w:val="es-419"/>
+        </w:rPr>
+        <w:t>backend</w:t>
+      </w:r>
+      <w:proofErr w:type="spellEnd"/>
+      <w:r>
+        <w:rPr>
+          <w:lang w:val="es-419"/>
+        </w:rPr>
+        <w:t xml:space="preserve"> y espera la respuesta con la información.</w:t>
       </w:r>
     </w:p>
     <w:p>
@@ -104,8 +132,13 @@
         <w:pStyle w:val="Listaconvietas"/>
         <w:spacing w:after="60"/>
       </w:pPr>
-      <w:r>
-        <w:t>Cliente → Frontend → Backend</w:t>
+      <w:proofErr w:type="spellStart"/>
+      <w:r>
+        <w:t>Cliente</w:t>
+      </w:r>
+      <w:proofErr w:type="spellEnd"/>
+      <w:r>
+        <w:t xml:space="preserve"> → Frontend → Backend</w:t>
       </w:r>
     </w:p>
     <w:p>
@@ -167,8 +200,13 @@
         <w:spacing w:after="60"/>
       </w:pPr>
       <w:r>
-        <w:t>Frontend → Backend → Base de datos</w:t>
-      </w:r>
+        <w:t xml:space="preserve">Frontend → Backend → Base de </w:t>
+      </w:r>
+      <w:proofErr w:type="spellStart"/>
+      <w:r>
+        <w:t>datos</w:t>
+      </w:r>
+      <w:proofErr w:type="spellEnd"/>
     </w:p>
     <w:p>
       <w:pPr>
@@ -220,7 +258,21 @@
         <w:rPr>
           <w:lang w:val="es-419"/>
         </w:rPr>
-        <w:t>El cliente ingresa su correo y contraseña. El backend comprueba los datos y devuelve inmediatamente si el inicio de sesión fue correcto.</w:t>
+        <w:t xml:space="preserve">El cliente ingresa su correo y contraseña. El </w:t>
+      </w:r>
+      <w:proofErr w:type="spellStart"/>
+      <w:r>
+        <w:rPr>
+          <w:lang w:val="es-419"/>
+        </w:rPr>
+        <w:t>backend</w:t>
+      </w:r>
+      <w:proofErr w:type="spellEnd"/>
+      <w:r>
+        <w:rPr>
+          <w:lang w:val="es-419"/>
+        </w:rPr>
+        <w:t xml:space="preserve"> comprueba los datos y devuelve inmediatamente si el inicio de sesión fue correcto.</w:t>
       </w:r>
     </w:p>
     <w:p>
@@ -229,8 +281,13 @@
         <w:spacing w:after="60"/>
       </w:pPr>
       <w:r>
-        <w:t>Frontend → Backend → Base de datos</w:t>
-      </w:r>
+        <w:t xml:space="preserve">Frontend → Backend → Base de </w:t>
+      </w:r>
+      <w:proofErr w:type="spellStart"/>
+      <w:r>
+        <w:t>datos</w:t>
+      </w:r>
+      <w:proofErr w:type="spellEnd"/>
     </w:p>
     <w:p>
       <w:pPr>
@@ -282,7 +339,21 @@
         <w:rPr>
           <w:lang w:val="es-419"/>
         </w:rPr>
-        <w:t>Cuando el cliente compra una planta, el backend envía la información del pago al servicio de pagos y espera su respuesta.</w:t>
+        <w:t xml:space="preserve">Cuando el cliente compra una planta, el </w:t>
+      </w:r>
+      <w:proofErr w:type="spellStart"/>
+      <w:r>
+        <w:rPr>
+          <w:lang w:val="es-419"/>
+        </w:rPr>
+        <w:t>backend</w:t>
+      </w:r>
+      <w:proofErr w:type="spellEnd"/>
+      <w:r>
+        <w:rPr>
+          <w:lang w:val="es-419"/>
+        </w:rPr>
+        <w:t xml:space="preserve"> envía la información del pago al servicio de pagos y espera su respuesta.</w:t>
       </w:r>
     </w:p>
     <w:p>
@@ -291,8 +362,21 @@
         <w:spacing w:after="60"/>
       </w:pPr>
       <w:r>
-        <w:t>Backend → Servicio de pagos</w:t>
-      </w:r>
+        <w:t xml:space="preserve">Backend → </w:t>
+      </w:r>
+      <w:proofErr w:type="spellStart"/>
+      <w:r>
+        <w:t>Servicio</w:t>
+      </w:r>
+      <w:proofErr w:type="spellEnd"/>
+      <w:r>
+        <w:t xml:space="preserve"> de </w:t>
+      </w:r>
+      <w:proofErr w:type="spellStart"/>
+      <w:r>
+        <w:t>pagos</w:t>
+      </w:r>
+      <w:proofErr w:type="spellEnd"/>
     </w:p>
     <w:p>
       <w:pPr>
@@ -382,8 +466,21 @@
         <w:spacing w:after="60"/>
       </w:pPr>
       <w:r>
-        <w:t>Backend → Cola → Servicio de notificaciones</w:t>
-      </w:r>
+        <w:t xml:space="preserve">Backend → Cola → </w:t>
+      </w:r>
+      <w:proofErr w:type="spellStart"/>
+      <w:r>
+        <w:t>Servicio</w:t>
+      </w:r>
+      <w:proofErr w:type="spellEnd"/>
+      <w:r>
+        <w:t xml:space="preserve"> de </w:t>
+      </w:r>
+      <w:proofErr w:type="spellStart"/>
+      <w:r>
+        <w:t>notificaciones</w:t>
+      </w:r>
+      <w:proofErr w:type="spellEnd"/>
     </w:p>
     <w:p>
       <w:pPr>
@@ -391,16 +488,50 @@
         <w:spacing w:after="60"/>
       </w:pPr>
       <w:r>
-        <w:t>Tipo: mensaje/evento</w:t>
-      </w:r>
+        <w:t xml:space="preserve">Tipo: </w:t>
+      </w:r>
+      <w:proofErr w:type="spellStart"/>
+      <w:r>
+        <w:t>mensaje</w:t>
+      </w:r>
+      <w:proofErr w:type="spellEnd"/>
+      <w:r>
+        <w:t>/</w:t>
+      </w:r>
+      <w:proofErr w:type="spellStart"/>
+      <w:r>
+        <w:t>evento</w:t>
+      </w:r>
+      <w:proofErr w:type="spellEnd"/>
     </w:p>
     <w:p>
       <w:pPr>
         <w:pStyle w:val="Listaconvietas"/>
         <w:spacing w:after="60"/>
       </w:pPr>
-      <w:r>
-        <w:t>Resultado: correo de confirmación.</w:t>
+      <w:proofErr w:type="spellStart"/>
+      <w:r>
+        <w:t>Resultado</w:t>
+      </w:r>
+      <w:proofErr w:type="spellEnd"/>
+      <w:r>
+        <w:t xml:space="preserve">: </w:t>
+      </w:r>
+      <w:proofErr w:type="spellStart"/>
+      <w:r>
+        <w:t>correo</w:t>
+      </w:r>
+      <w:proofErr w:type="spellEnd"/>
+      <w:r>
+        <w:t xml:space="preserve"> de </w:t>
+      </w:r>
+      <w:proofErr w:type="spellStart"/>
+      <w:r>
+        <w:t>confirmación</w:t>
+      </w:r>
+      <w:proofErr w:type="spellEnd"/>
+      <w:r>
+        <w:t>.</w:t>
       </w:r>
     </w:p>
     <w:p>
@@ -429,7 +560,21 @@
         <w:rPr>
           <w:lang w:val="es-419"/>
         </w:rPr>
-        <w:t>Cuando un pedido cambia de estado, por ejemplo de 'preparando' a 'enviado', se genera un evento para informar al cliente.</w:t>
+        <w:t xml:space="preserve">Cuando un pedido cambia de estado, por </w:t>
+      </w:r>
+      <w:proofErr w:type="gramStart"/>
+      <w:r>
+        <w:rPr>
+          <w:lang w:val="es-419"/>
+        </w:rPr>
+        <w:t>ejemplo</w:t>
+      </w:r>
+      <w:proofErr w:type="gramEnd"/>
+      <w:r>
+        <w:rPr>
+          <w:lang w:val="es-419"/>
+        </w:rPr>
+        <w:t xml:space="preserve"> de 'preparando' a 'enviado', se genera un evento para informar al cliente.</w:t>
       </w:r>
     </w:p>
     <w:p>
@@ -438,8 +583,13 @@
         <w:spacing w:after="60"/>
       </w:pPr>
       <w:r>
-        <w:t>Backend → Cola → Notificaciones</w:t>
-      </w:r>
+        <w:t xml:space="preserve">Backend → Cola → </w:t>
+      </w:r>
+      <w:proofErr w:type="spellStart"/>
+      <w:r>
+        <w:t>Notificaciones</w:t>
+      </w:r>
+      <w:proofErr w:type="spellEnd"/>
     </w:p>
     <w:p>
       <w:pPr>
@@ -447,28 +597,79 @@
         <w:spacing w:after="60"/>
       </w:pPr>
       <w:r>
-        <w:t>Tipo: mensaje/evento</w:t>
-      </w:r>
+        <w:t xml:space="preserve">Tipo: </w:t>
+      </w:r>
+      <w:proofErr w:type="spellStart"/>
+      <w:r>
+        <w:t>mensaje</w:t>
+      </w:r>
+      <w:proofErr w:type="spellEnd"/>
+      <w:r>
+        <w:t>/</w:t>
+      </w:r>
+      <w:proofErr w:type="spellStart"/>
+      <w:r>
+        <w:t>evento</w:t>
+      </w:r>
+      <w:proofErr w:type="spellEnd"/>
     </w:p>
     <w:p>
       <w:pPr>
         <w:pStyle w:val="Listaconvietas"/>
         <w:spacing w:after="60"/>
       </w:pPr>
-      <w:r>
-        <w:t>Resultado: aviso al cliente.</w:t>
+      <w:proofErr w:type="spellStart"/>
+      <w:r>
+        <w:t>Resultado</w:t>
+      </w:r>
+      <w:proofErr w:type="spellEnd"/>
+      <w:r>
+        <w:t xml:space="preserve">: aviso al </w:t>
+      </w:r>
+      <w:proofErr w:type="spellStart"/>
+      <w:r>
+        <w:t>cliente</w:t>
+      </w:r>
+      <w:proofErr w:type="spellEnd"/>
+      <w:r>
+        <w:t>.</w:t>
       </w:r>
     </w:p>
     <w:p>
       <w:pPr>
         <w:spacing w:before="200" w:after="100"/>
       </w:pPr>
+      <w:proofErr w:type="spellStart"/>
       <w:r>
         <w:rPr>
           <w:b/>
           <w:sz w:val="28"/>
         </w:rPr>
-        <w:t>Comunicación 3: Actualización de stock</w:t>
+        <w:t>Comunicación</w:t>
+      </w:r>
+      <w:proofErr w:type="spellEnd"/>
+      <w:r>
+        <w:rPr>
+          <w:b/>
+          <w:sz w:val="28"/>
+        </w:rPr>
+        <w:t xml:space="preserve"> 3: </w:t>
+      </w:r>
+      <w:proofErr w:type="spellStart"/>
+      <w:r>
+        <w:rPr>
+          <w:b/>
+          <w:sz w:val="28"/>
+        </w:rPr>
+        <w:t>Actualización</w:t>
+      </w:r>
+      <w:proofErr w:type="spellEnd"/>
+      <w:r>
+        <w:rPr>
+          <w:b/>
+          <w:sz w:val="28"/>
+        </w:rPr>
+        <w:t xml:space="preserve"> de stock</w:t>
       </w:r>
     </w:p>
     <w:p>
@@ -490,8 +691,13 @@
         <w:spacing w:after="60"/>
       </w:pPr>
       <w:r>
-        <w:t>Backend → Cola → Inventario</w:t>
-      </w:r>
+        <w:t xml:space="preserve">Backend → Cola → </w:t>
+      </w:r>
+      <w:proofErr w:type="spellStart"/>
+      <w:r>
+        <w:t>Inventario</w:t>
+      </w:r>
+      <w:proofErr w:type="spellEnd"/>
     </w:p>
     <w:p>
       <w:pPr>
@@ -499,29 +705,89 @@
         <w:spacing w:after="60"/>
       </w:pPr>
       <w:r>
-        <w:t>Tipo: mensaje/evento</w:t>
-      </w:r>
+        <w:t xml:space="preserve">Tipo: </w:t>
+      </w:r>
+      <w:proofErr w:type="spellStart"/>
+      <w:r>
+        <w:t>mensaje</w:t>
+      </w:r>
+      <w:proofErr w:type="spellEnd"/>
+      <w:r>
+        <w:t>/</w:t>
+      </w:r>
+      <w:proofErr w:type="spellStart"/>
+      <w:r>
+        <w:t>evento</w:t>
+      </w:r>
+      <w:proofErr w:type="spellEnd"/>
     </w:p>
     <w:p>
       <w:pPr>
         <w:pStyle w:val="Listaconvietas"/>
         <w:spacing w:after="60"/>
       </w:pPr>
-      <w:r>
-        <w:t>Resultado: stock actualizado.</w:t>
+      <w:proofErr w:type="spellStart"/>
+      <w:r>
+        <w:t>Resultado</w:t>
+      </w:r>
+      <w:proofErr w:type="spellEnd"/>
+      <w:r>
+        <w:t xml:space="preserve">: stock </w:t>
+      </w:r>
+      <w:proofErr w:type="spellStart"/>
+      <w:r>
+        <w:t>actualizado</w:t>
+      </w:r>
+      <w:proofErr w:type="spellEnd"/>
+      <w:r>
+        <w:t>.</w:t>
       </w:r>
     </w:p>
     <w:p>
       <w:pPr>
         <w:spacing w:before="200" w:after="100"/>
       </w:pPr>
+      <w:proofErr w:type="spellStart"/>
       <w:r>
         <w:rPr>
           <w:b/>
           <w:sz w:val="28"/>
         </w:rPr>
-        <w:t>Comunicación 4: Registro de acciones</w:t>
-      </w:r>
+        <w:t>Comunicación</w:t>
+      </w:r>
+      <w:proofErr w:type="spellEnd"/>
+      <w:r>
+        <w:rPr>
+          <w:b/>
+          <w:sz w:val="28"/>
+        </w:rPr>
+        <w:t xml:space="preserve"> 4: </w:t>
+      </w:r>
+      <w:proofErr w:type="spellStart"/>
+      <w:r>
+        <w:rPr>
+          <w:b/>
+          <w:sz w:val="28"/>
+        </w:rPr>
+        <w:t>Registro</w:t>
+      </w:r>
+      <w:proofErr w:type="spellEnd"/>
+      <w:r>
+        <w:rPr>
+          <w:b/>
+          <w:sz w:val="28"/>
+        </w:rPr>
+        <w:t xml:space="preserve"> de </w:t>
+      </w:r>
+      <w:proofErr w:type="spellStart"/>
+      <w:r>
+        <w:rPr>
+          <w:b/>
+          <w:sz w:val="28"/>
+        </w:rPr>
+        <w:t>acciones</w:t>
+      </w:r>
+      <w:proofErr w:type="spellEnd"/>
     </w:p>
     <w:p>
       <w:pPr>
@@ -542,8 +808,13 @@
         <w:spacing w:after="60"/>
       </w:pPr>
       <w:r>
-        <w:t>Backend → Cola → Auditoría</w:t>
-      </w:r>
+        <w:t xml:space="preserve">Backend → Cola → </w:t>
+      </w:r>
+      <w:proofErr w:type="spellStart"/>
+      <w:r>
+        <w:t>Auditoría</w:t>
+      </w:r>
+      <w:proofErr w:type="spellEnd"/>
     </w:p>
     <w:p>
       <w:pPr>
@@ -551,29 +822,97 @@
         <w:spacing w:after="60"/>
       </w:pPr>
       <w:r>
-        <w:t>Tipo: mensaje/evento</w:t>
-      </w:r>
+        <w:t xml:space="preserve">Tipo: </w:t>
+      </w:r>
+      <w:proofErr w:type="spellStart"/>
+      <w:r>
+        <w:t>mensaje</w:t>
+      </w:r>
+      <w:proofErr w:type="spellEnd"/>
+      <w:r>
+        <w:t>/</w:t>
+      </w:r>
+      <w:proofErr w:type="spellStart"/>
+      <w:r>
+        <w:t>evento</w:t>
+      </w:r>
+      <w:proofErr w:type="spellEnd"/>
     </w:p>
     <w:p>
       <w:pPr>
         <w:pStyle w:val="Listaconvietas"/>
         <w:spacing w:after="60"/>
       </w:pPr>
-      <w:r>
-        <w:t>Resultado: acción registrada.</w:t>
+      <w:proofErr w:type="spellStart"/>
+      <w:r>
+        <w:t>Resultado</w:t>
+      </w:r>
+      <w:proofErr w:type="spellEnd"/>
+      <w:r>
+        <w:t xml:space="preserve">: </w:t>
+      </w:r>
+      <w:proofErr w:type="spellStart"/>
+      <w:r>
+        <w:t>acción</w:t>
+      </w:r>
+      <w:proofErr w:type="spellEnd"/>
+      <w:r>
+        <w:t xml:space="preserve"> </w:t>
+      </w:r>
+      <w:proofErr w:type="spellStart"/>
+      <w:r>
+        <w:t>registrada</w:t>
+      </w:r>
+      <w:proofErr w:type="spellEnd"/>
+      <w:r>
+        <w:t>.</w:t>
       </w:r>
     </w:p>
     <w:p>
       <w:pPr>
         <w:spacing w:before="200" w:after="100"/>
       </w:pPr>
+      <w:proofErr w:type="spellStart"/>
       <w:r>
         <w:rPr>
           <w:b/>
           <w:sz w:val="28"/>
         </w:rPr>
-        <w:t>Comunicación 5: Generación de comprobante</w:t>
-      </w:r>
+        <w:t>Comunicación</w:t>
+      </w:r>
+      <w:proofErr w:type="spellEnd"/>
+      <w:r>
+        <w:rPr>
+          <w:b/>
+          <w:sz w:val="28"/>
+        </w:rPr>
+        <w:t xml:space="preserve"> 5: </w:t>
+      </w:r>
+      <w:proofErr w:type="spellStart"/>
+      <w:r>
+        <w:rPr>
+          <w:b/>
+          <w:sz w:val="28"/>
+        </w:rPr>
+        <w:t>Generación</w:t>
+      </w:r>
+      <w:proofErr w:type="spellEnd"/>
+      <w:r>
+        <w:rPr>
+          <w:b/>
+          <w:sz w:val="28"/>
+        </w:rPr>
+        <w:t xml:space="preserve"> de </w:t>
+      </w:r>
+      <w:proofErr w:type="spellStart"/>
+      <w:r>
+        <w:rPr>
+          <w:b/>
+          <w:sz w:val="28"/>
+        </w:rPr>
+        <w:t>comprobante</w:t>
+      </w:r>
+      <w:proofErr w:type="spellEnd"/>
     </w:p>
     <w:p>
       <w:pPr>
@@ -594,8 +933,21 @@
         <w:spacing w:after="60"/>
       </w:pPr>
       <w:r>
-        <w:t>Backend → Cola → Servicio de documentos</w:t>
-      </w:r>
+        <w:t xml:space="preserve">Backend → Cola → </w:t>
+      </w:r>
+      <w:proofErr w:type="spellStart"/>
+      <w:r>
+        <w:t>Servicio</w:t>
+      </w:r>
+      <w:proofErr w:type="spellEnd"/>
+      <w:r>
+        <w:t xml:space="preserve"> de </w:t>
+      </w:r>
+      <w:proofErr w:type="spellStart"/>
+      <w:r>
+        <w:t>documentos</w:t>
+      </w:r>
+      <w:proofErr w:type="spellEnd"/>
     </w:p>
     <w:p>
       <w:pPr>
@@ -603,81 +955,57 @@
         <w:spacing w:after="60"/>
       </w:pPr>
       <w:r>
-        <w:t>Tipo: mensaje/evento</w:t>
-      </w:r>
+        <w:t xml:space="preserve">Tipo: </w:t>
+      </w:r>
+      <w:proofErr w:type="spellStart"/>
+      <w:r>
+        <w:t>mensaje</w:t>
+      </w:r>
+      <w:proofErr w:type="spellEnd"/>
+      <w:r>
+        <w:t>/</w:t>
+      </w:r>
+      <w:proofErr w:type="spellStart"/>
+      <w:r>
+        <w:t>evento</w:t>
+      </w:r>
+      <w:proofErr w:type="spellEnd"/>
     </w:p>
     <w:p>
       <w:pPr>
         <w:pStyle w:val="Listaconvietas"/>
         <w:spacing w:after="60"/>
       </w:pPr>
-      <w:r>
-        <w:t>Resultado: comprobante generado.</w:t>
+      <w:proofErr w:type="spellStart"/>
+      <w:r>
+        <w:t>Resultado</w:t>
+      </w:r>
+      <w:proofErr w:type="spellEnd"/>
+      <w:r>
+        <w:t xml:space="preserve">: </w:t>
+      </w:r>
+      <w:proofErr w:type="spellStart"/>
+      <w:r>
+        <w:t>comprobante</w:t>
+      </w:r>
+      <w:proofErr w:type="spellEnd"/>
+      <w:r>
+        <w:t xml:space="preserve"> </w:t>
+      </w:r>
+      <w:proofErr w:type="spellStart"/>
+      <w:r>
+        <w:t>generado</w:t>
+      </w:r>
+      <w:proofErr w:type="spellEnd"/>
+      <w:r>
+        <w:t>.</w:t>
       </w:r>
     </w:p>
     <w:p>
       <w:pPr>
         <w:spacing w:before="200" w:after="100"/>
-      </w:pPr>
-      <w:r>
         <w:rPr>
-          <w:b/>
-          <w:sz w:val="28"/>
-        </w:rPr>
-        <w:t>Comunicación 6: Carrito abandonado</w:t>
-      </w:r>
-    </w:p>
-    <w:p>
-      <w:pPr>
-        <w:rPr>
-          <w:lang w:val="es-419"/>
-        </w:rPr>
-      </w:pPr>
-      <w:r>
-        <w:rPr>
-          <w:lang w:val="es-419"/>
-        </w:rPr>
-        <w:t>Si un cliente deja productos en el carrito sin comprar, el sistema puede generar un recordatorio posteriormente.</w:t>
-      </w:r>
-    </w:p>
-    <w:p>
-      <w:pPr>
-        <w:pStyle w:val="Listaconvietas"/>
-        <w:spacing w:after="60"/>
-      </w:pPr>
-      <w:r>
-        <w:t>Sistema → Cola → Servicio de notificaciones</w:t>
-      </w:r>
-    </w:p>
-    <w:p>
-      <w:pPr>
-        <w:pStyle w:val="Listaconvietas"/>
-        <w:spacing w:after="60"/>
-      </w:pPr>
-      <w:r>
-        <w:lastRenderedPageBreak/>
-        <w:t>Tipo: mensaje/evento</w:t>
-      </w:r>
-    </w:p>
-    <w:p>
-      <w:pPr>
-        <w:pStyle w:val="Listaconvietas"/>
-        <w:spacing w:after="60"/>
-        <w:rPr>
-          <w:lang w:val="es-419"/>
-        </w:rPr>
-      </w:pPr>
-      <w:r>
-        <w:rPr>
-          <w:lang w:val="es-419"/>
-        </w:rPr>
-        <w:t>Resultado: recordatorio enviado al cliente.</w:t>
-      </w:r>
-    </w:p>
-    <w:p>
-      <w:pPr>
-        <w:spacing w:before="200" w:after="100"/>
-        <w:rPr>
+          <w:u w:val="single"/>
           <w:lang w:val="es-419"/>
         </w:rPr>
       </w:pPr>
@@ -726,6 +1054,7 @@
           <w:sz w:val="24"/>
           <w:lang w:val="es-419"/>
         </w:rPr>
+        <w:lastRenderedPageBreak/>
         <w:t>↓</w:t>
       </w:r>
     </w:p>
@@ -849,7 +1178,7 @@
 </file>
 
 <file path=word/numbering.xml><?xml version="1.0" encoding="utf-8"?>
-<w:numbering xmlns:wpc="http://schemas.microsoft.com/office/word/2010/wordprocessingCanvas" xmlns:cx="http://schemas.microsoft.com/office/drawing/2014/chartex" xmlns:cx1="http://schemas.microsoft.com/office/drawing/2015/9/8/chartex" xmlns:cx2="http://schemas.microsoft.com/office/drawing/2015/10/21/chartex" xmlns:cx3="http://schemas.microsoft.com/office/drawing/2016/5/9/chartex" xmlns:cx4="http://schemas.microsoft.com/office/drawing/2016/5/10/chartex" xmlns:cx5="http://schemas.microsoft.com/office/drawing/2016/5/11/chartex" xmlns:cx6="http://schemas.microsoft.com/office/drawing/2016/5/12/chartex" xmlns:cx7="http://schemas.microsoft.com/office/drawing/2016/5/13/chartex" xmlns:cx8="http://schemas.microsoft.com/office/drawing/2016/5/14/chartex" xmlns:mc="http://schemas.openxmlformats.org/markup-compatibility/2006" xmlns:aink="http://schemas.microsoft.com/office/drawing/2016/ink" xmlns:am3d="http://schemas.microsoft.com/office/drawing/2017/model3d" xmlns:o="urn:schemas-microsoft-com:office:office" xmlns:oel="http://schemas.microsoft.com/office/2019/extlst" xmlns:r="http://schemas.openxmlformats.org/officeDocument/2006/relationships" xmlns:m="http://schemas.openxmlformats.org/officeDocument/2006/math" xmlns:v="urn:schemas-microsoft-com:vml" xmlns:wp14="http://schemas.microsoft.com/office/word/2010/wordprocessingDrawing" xmlns:wp="http://schemas.openxmlformats.org/drawingml/2006/wordprocessingDrawing" xmlns:w10="urn:schemas-microsoft-com:office:word" xmlns:w="http://schemas.openxmlformats.org/wordprocessingml/2006/main" xmlns:w14="http://schemas.microsoft.com/office/word/2010/wordml" xmlns:w15="http://schemas.microsoft.com/office/word/2012/wordml" xmlns:w16cex="http://schemas.microsoft.com/office/word/2018/wordml/cex" xmlns:w16cid="http://schemas.microsoft.com/office/word/2016/wordml/cid" xmlns:w16="http://schemas.microsoft.com/office/word/2018/wordml" xmlns:w16du="http://schemas.microsoft.com/office/word/2023/wordml/word16du" xmlns:w16sdtdh="http://schemas.microsoft.com/office/word/2020/wordml/sdtdatahash" xmlns:w16sdtfl="http://schemas.microsoft.com/office/word/2024/wordml/sdtformatlock" xmlns:w16se="http://schemas.microsoft.com/office/word/2015/wordml/symex" xmlns:wpg="http://schemas.microsoft.com/office/word/2010/wordprocessingGroup" xmlns:wpi="http://schemas.microsoft.com/office/word/2010/wordprocessingInk" xmlns:wne="http://schemas.microsoft.com/office/word/2006/wordml" xmlns:wps="http://schemas.microsoft.com/office/word/2010/wordprocessingShape" mc:Ignorable="w14 w15 w16se w16cid w16 w16cex w16sdtdh w16sdtfl w16du wp14">
+<w:numbering xmlns:wpc="http://schemas.microsoft.com/office/word/2010/wordprocessingCanvas" xmlns:cx="http://schemas.microsoft.com/office/drawing/2014/chartex" xmlns:cx1="http://schemas.microsoft.com/office/drawing/2015/9/8/chartex" xmlns:cx2="http://schemas.microsoft.com/office/drawing/2015/10/21/chartex" xmlns:cx3="http://schemas.microsoft.com/office/drawing/2016/5/9/chartex" xmlns:cx4="http://schemas.microsoft.com/office/drawing/2016/5/10/chartex" xmlns:cx5="http://schemas.microsoft.com/office/drawing/2016/5/11/chartex" xmlns:cx6="http://schemas.microsoft.com/office/drawing/2016/5/12/chartex" xmlns:cx7="http://schemas.microsoft.com/office/drawing/2016/5/13/chartex" xmlns:cx8="http://schemas.microsoft.com/office/drawing/2016/5/14/chartex" xmlns:mc="http://schemas.openxmlformats.org/markup-compatibility/2006" xmlns:aink="http://schemas.microsoft.com/office/drawing/2016/ink" xmlns:am3d="http://schemas.microsoft.com/office/drawing/2017/model3d" xmlns:o="urn:schemas-microsoft-com:office:office" xmlns:oel="http://schemas.microsoft.com/office/2019/extlst" xmlns:r="http://schemas.openxmlformats.org/officeDocument/2006/relationships" xmlns:m="http://schemas.openxmlformats.org/officeDocument/2006/math" xmlns:v="urn:schemas-microsoft-com:vml" xmlns:wp14="http://schemas.microsoft.com/office/word/2010/wordprocessingDrawing" xmlns:wp="http://schemas.openxmlformats.org/drawingml/2006/wordprocessingDrawing" xmlns:w10="urn:schemas-microsoft-com:office:word" xmlns:w="http://schemas.openxmlformats.org/wordprocessingml/2006/main" xmlns:w14="http://schemas.microsoft.com/office/word/2010/wordml" xmlns:w15="http://schemas.microsoft.com/office/word/2012/wordml" xmlns:w16cex="http://schemas.microsoft.com/office/word/2018/wordml/cex" xmlns:w16cid="http://schemas.microsoft.com/office/word/2016/wordml/cid" xmlns:w16="http://schemas.microsoft.com/office/word/2018/wordml" xmlns:w16sdtdh="http://schemas.microsoft.com/office/word/2020/wordml/sdtdatahash" xmlns:w16se="http://schemas.microsoft.com/office/word/2015/wordml/symex" xmlns:wpg="http://schemas.microsoft.com/office/word/2010/wordprocessingGroup" xmlns:wpi="http://schemas.microsoft.com/office/word/2010/wordprocessingInk" xmlns:wne="http://schemas.microsoft.com/office/word/2006/wordml" xmlns:wps="http://schemas.microsoft.com/office/word/2010/wordprocessingShape" mc:Ignorable="w14 w15 w16se w16cid w16 w16cex w16sdtdh wp14">
   <w:abstractNum w:abstractNumId="0" w15:restartNumberingAfterBreak="0">
     <w:nsid w:val="FFFFFF7C"/>
     <w:multiLevelType w:val="singleLevel"/>
@@ -1003,7 +1332,7 @@
   <w:abstractNum w:abstractNumId="8" w15:restartNumberingAfterBreak="0">
     <w:nsid w:val="FFFFFF89"/>
     <w:multiLevelType w:val="singleLevel"/>
-    <w:tmpl w:val="29761A62"/>
+    <w:tmpl w:val="79284F04"/>
     <w:lvl w:ilvl="0">
       <w:start w:val="1"/>
       <w:numFmt w:val="bullet"/>
@@ -1052,7 +1381,7 @@
 </file>
 
 <file path=word/styles.xml><?xml version="1.0" encoding="utf-8"?>
-<w:styles xmlns:mc="http://schemas.openxmlformats.org/markup-compatibility/2006" xmlns:r="http://schemas.openxmlformats.org/officeDocument/2006/relationships" xmlns:w="http://schemas.openxmlformats.org/wordprocessingml/2006/main" xmlns:w14="http://schemas.microsoft.com/office/word/2010/wordml" xmlns:w15="http://schemas.microsoft.com/office/word/2012/wordml" xmlns:w16cex="http://schemas.microsoft.com/office/word/2018/wordml/cex" xmlns:w16cid="http://schemas.microsoft.com/office/word/2016/wordml/cid" xmlns:w16="http://schemas.microsoft.com/office/word/2018/wordml" xmlns:w16du="http://schemas.microsoft.com/office/word/2023/wordml/word16du" xmlns:w16sdtdh="http://schemas.microsoft.com/office/word/2020/wordml/sdtdatahash" xmlns:w16sdtfl="http://schemas.microsoft.com/office/word/2024/wordml/sdtformatlock" xmlns:w16se="http://schemas.microsoft.com/office/word/2015/wordml/symex" mc:Ignorable="w14 w15 w16se w16cid w16 w16cex w16sdtdh w16sdtfl w16du">
+<w:styles xmlns:mc="http://schemas.openxmlformats.org/markup-compatibility/2006" xmlns:r="http://schemas.openxmlformats.org/officeDocument/2006/relationships" xmlns:w="http://schemas.openxmlformats.org/wordprocessingml/2006/main" xmlns:w14="http://schemas.microsoft.com/office/word/2010/wordml" xmlns:w15="http://schemas.microsoft.com/office/word/2012/wordml" xmlns:w16cex="http://schemas.microsoft.com/office/word/2018/wordml/cex" xmlns:w16cid="http://schemas.microsoft.com/office/word/2016/wordml/cid" xmlns:w16="http://schemas.microsoft.com/office/word/2018/wordml" xmlns:w16sdtdh="http://schemas.microsoft.com/office/word/2020/wordml/sdtdatahash" xmlns:w16se="http://schemas.microsoft.com/office/word/2015/wordml/symex" mc:Ignorable="w14 w15 w16se w16cid w16 w16cex w16sdtdh">
   <w:docDefaults>
     <w:rPrDefault>
       <w:rPr>
@@ -2242,7 +2571,7 @@
       <w:szCs w:val="18"/>
     </w:rPr>
   </w:style>
-  <w:style w:type="character" w:styleId="Fuerte">
+  <w:style w:type="character" w:styleId="Textoennegrita">
     <w:name w:val="Strong"/>
     <w:basedOn w:val="Fuentedeprrafopredeter"/>
     <w:uiPriority w:val="22"/>

</xml_diff>